<commit_message>
INSP-21 unificado y INSP-03 sin bloque extra: mismo bloque de firmantes en los 58 Word
Co-Authored-By: Claude Sonnet 5.5 <noreply@anthropic.com>
</commit_message>
<xml_diff>
--- a/docs/formatos/inspecciones/INSP-03 Pruebas Grupos Generadores El Mauro.docx
+++ b/docs/formatos/inspecciones/INSP-03 Pruebas Grupos Generadores El Mauro.docx
@@ -4572,223 +4572,6 @@
             <w:r>
               <w:t xml:space="preserve"> </w:t>
             </w:r>
-          </w:p>
-        </w:tc>
-      </w:tr>
-      <w:tr>
-        <w:trPr>
-          <w:trHeight w:val="416"/>
-        </w:trPr>
-        <w:tc>
-          <w:tcPr>
-            <w:tcW w:w="10639" w:type="dxa"/>
-            <w:gridSpan w:val="4"/>
-            <w:tcBorders>
-              <w:top w:val="single" w:sz="18" w:space="0" w:color="000000"/>
-              <w:left w:val="single" w:sz="18" w:space="0" w:color="000000"/>
-              <w:bottom w:val="single" w:sz="8" w:space="0" w:color="000000"/>
-              <w:right w:val="single" w:sz="18" w:space="0" w:color="000000"/>
-            </w:tcBorders>
-            <w:shd w:val="clear" w:color="auto" w:fill="D9D9D9"/>
-          </w:tcPr>
-          <w:p>
-            <w:pPr>
-              <w:pStyle w:val="TableParagraph"/>
-              <w:spacing w:before="58"/>
-              <w:ind w:left="2682" w:right="2627"/>
-              <w:jc w:val="center"/>
-            </w:pPr>
-            <w:r>
-              <w:t>Supervisor</w:t>
-            </w:r>
-            <w:r>
-              <w:rPr>
-                <w:spacing w:val="-1"/>
-              </w:rPr>
-              <w:t xml:space="preserve"> </w:t>
-            </w:r>
-            <w:r>
-              <w:t>Ejecutor</w:t>
-            </w:r>
-            <w:r>
-              <w:rPr>
-                <w:spacing w:val="-1"/>
-              </w:rPr>
-              <w:t xml:space="preserve"> </w:t>
-            </w:r>
-            <w:r>
-              <w:t>o</w:t>
-            </w:r>
-            <w:r>
-              <w:rPr>
-                <w:spacing w:val="1"/>
-              </w:rPr>
-              <w:t xml:space="preserve"> </w:t>
-            </w:r>
-            <w:r>
-              <w:t>Responsable</w:t>
-            </w:r>
-            <w:r>
-              <w:rPr>
-                <w:spacing w:val="-1"/>
-              </w:rPr>
-              <w:t xml:space="preserve"> </w:t>
-            </w:r>
-            <w:r>
-              <w:t>de</w:t>
-            </w:r>
-            <w:r>
-              <w:rPr>
-                <w:spacing w:val="-1"/>
-              </w:rPr>
-              <w:t xml:space="preserve"> </w:t>
-            </w:r>
-            <w:r>
-              <w:t>Trabajo</w:t>
-            </w:r>
-          </w:p>
-        </w:tc>
-      </w:tr>
-      <w:tr>
-        <w:trPr>
-          <w:trHeight w:val="328"/>
-        </w:trPr>
-        <w:tc>
-          <w:tcPr>
-            <w:tcW w:w="4575" w:type="dxa"/>
-            <w:gridSpan w:val="2"/>
-            <w:tcBorders>
-              <w:top w:val="single" w:sz="8" w:space="0" w:color="000000"/>
-              <w:left w:val="single" w:sz="18" w:space="0" w:color="000000"/>
-              <w:bottom w:val="single" w:sz="8" w:space="0" w:color="000000"/>
-              <w:right w:val="single" w:sz="8" w:space="0" w:color="000000"/>
-            </w:tcBorders>
-          </w:tcPr>
-          <w:p>
-            <w:pPr>
-              <w:jc w:val="center"/>
-            </w:pPr>
-            <w:r>
-              <w:t>Nombre</w:t>
-            </w:r>
-          </w:p>
-        </w:tc>
-        <w:tc>
-          <w:tcPr>
-            <w:tcW w:w="3056" w:type="dxa"/>
-            <w:tcBorders>
-              <w:top w:val="single" w:sz="8" w:space="0" w:color="000000"/>
-              <w:left w:val="single" w:sz="8" w:space="0" w:color="000000"/>
-              <w:bottom w:val="single" w:sz="8" w:space="0" w:color="000000"/>
-              <w:right w:val="single" w:sz="8" w:space="0" w:color="000000"/>
-            </w:tcBorders>
-          </w:tcPr>
-          <w:p>
-            <w:pPr>
-              <w:jc w:val="center"/>
-              <w:rPr>
-                <w:rFonts w:ascii="Arial" w:hAnsi="Arial" w:cs="Arial"/>
-              </w:rPr>
-            </w:pPr>
-            <w:r>
-              <w:rPr>
-                <w:rFonts w:ascii="Arial" w:hAnsi="Arial" w:cs="Arial"/>
-              </w:rPr>
-              <w:t>Fecha</w:t>
-            </w:r>
-          </w:p>
-        </w:tc>
-        <w:tc>
-          <w:tcPr>
-            <w:tcW w:w="3008" w:type="dxa"/>
-            <w:tcBorders>
-              <w:top w:val="single" w:sz="8" w:space="0" w:color="000000"/>
-              <w:left w:val="single" w:sz="8" w:space="0" w:color="000000"/>
-              <w:bottom w:val="single" w:sz="8" w:space="0" w:color="000000"/>
-              <w:right w:val="single" w:sz="18" w:space="0" w:color="000000"/>
-            </w:tcBorders>
-          </w:tcPr>
-          <w:p>
-            <w:pPr>
-              <w:jc w:val="center"/>
-              <w:rPr>
-                <w:rFonts w:ascii="Arial" w:hAnsi="Arial" w:cs="Arial"/>
-              </w:rPr>
-            </w:pPr>
-            <w:r>
-              <w:rPr>
-                <w:rFonts w:ascii="Arial" w:hAnsi="Arial" w:cs="Arial"/>
-              </w:rPr>
-              <w:t>Firma</w:t>
-            </w:r>
-          </w:p>
-        </w:tc>
-      </w:tr>
-      <w:tr>
-        <w:trPr>
-          <w:trHeight w:val="572"/>
-        </w:trPr>
-        <w:tc>
-          <w:tcPr>
-            <w:tcW w:w="4575" w:type="dxa"/>
-            <w:gridSpan w:val="2"/>
-            <w:tcBorders>
-              <w:top w:val="single" w:sz="8" w:space="0" w:color="000000"/>
-              <w:left w:val="single" w:sz="18" w:space="0" w:color="000000"/>
-              <w:bottom w:val="single" w:sz="18" w:space="0" w:color="000000"/>
-              <w:right w:val="single" w:sz="8" w:space="0" w:color="000000"/>
-            </w:tcBorders>
-            <w:vAlign w:val="center"/>
-          </w:tcPr>
-          <w:p>
-            <w:pPr>
-              <w:pStyle w:val="TableParagraph"/>
-              <w:jc w:val="center"/>
-              <w:rPr>
-                <w:rFonts w:ascii="Times New Roman" w:hAnsi="Times New Roman"/>
-                <w:sz w:val="20"/>
-              </w:rPr>
-            </w:pPr>
-          </w:p>
-        </w:tc>
-        <w:tc>
-          <w:tcPr>
-            <w:tcW w:w="3056" w:type="dxa"/>
-            <w:tcBorders>
-              <w:top w:val="single" w:sz="8" w:space="0" w:color="000000"/>
-              <w:left w:val="single" w:sz="8" w:space="0" w:color="000000"/>
-              <w:bottom w:val="single" w:sz="18" w:space="0" w:color="000000"/>
-              <w:right w:val="single" w:sz="8" w:space="0" w:color="000000"/>
-            </w:tcBorders>
-            <w:vAlign w:val="center"/>
-          </w:tcPr>
-          <w:p>
-            <w:pPr>
-              <w:pStyle w:val="TableParagraph"/>
-              <w:jc w:val="center"/>
-              <w:rPr>
-                <w:rFonts w:ascii="Times New Roman" w:hAnsi="Times New Roman"/>
-                <w:sz w:val="20"/>
-              </w:rPr>
-            </w:pPr>
-          </w:p>
-        </w:tc>
-        <w:tc>
-          <w:tcPr>
-            <w:tcW w:w="3008" w:type="dxa"/>
-            <w:tcBorders>
-              <w:top w:val="single" w:sz="8" w:space="0" w:color="000000"/>
-              <w:left w:val="single" w:sz="8" w:space="0" w:color="000000"/>
-              <w:bottom w:val="single" w:sz="18" w:space="0" w:color="000000"/>
-              <w:right w:val="single" w:sz="18" w:space="0" w:color="000000"/>
-            </w:tcBorders>
-            <w:vAlign w:val="center"/>
-          </w:tcPr>
-          <w:p>
-            <w:pPr>
-              <w:pStyle w:val="TableParagraph"/>
-              <w:jc w:val="center"/>
-            </w:pPr>
           </w:p>
         </w:tc>
       </w:tr>

</xml_diff>